<commit_message>
minor corrections, updated technology stack section
</commit_message>
<xml_diff>
--- a/docs/Software Requirements Specification.docx
+++ b/docs/Software Requirements Specification.docx
@@ -4,7 +4,7 @@
   <w:body>
     <w:p>
       <w:pPr>
-        <w:pStyle w:val="Heading1"/>
+        <w:pStyle w:val="Nadpis1"/>
         <w:keepNext w:val="0"/>
         <w:keepLines w:val="0"/>
         <w:spacing w:before="480"/>
@@ -80,7 +80,7 @@
     </w:p>
     <w:p>
       <w:pPr>
-        <w:pStyle w:val="Heading2"/>
+        <w:pStyle w:val="Nadpis2"/>
         <w:keepNext w:val="0"/>
         <w:keepLines w:val="0"/>
         <w:numPr>
@@ -110,7 +110,7 @@
     </w:p>
     <w:p>
       <w:pPr>
-        <w:pStyle w:val="Heading2"/>
+        <w:pStyle w:val="Nadpis2"/>
         <w:keepNext w:val="0"/>
         <w:keepLines w:val="0"/>
         <w:spacing w:after="80"/>
@@ -134,7 +134,7 @@
     </w:p>
     <w:p>
       <w:pPr>
-        <w:pStyle w:val="Heading2"/>
+        <w:pStyle w:val="Nadpis2"/>
         <w:keepNext w:val="0"/>
         <w:keepLines w:val="0"/>
         <w:spacing w:after="80"/>
@@ -150,28 +150,12 @@
           <w:sz w:val="22"/>
           <w:szCs w:val="22"/>
         </w:rPr>
-        <w:t xml:space="preserve">This document specifies the requirements for the Rangefinder, a Raspberry PI based range-finding tool with a mobile phone app user interface. Its users </w:t>
-      </w:r>
-      <w:proofErr w:type="gramStart"/>
-      <w:r>
-        <w:rPr>
-          <w:sz w:val="22"/>
-          <w:szCs w:val="22"/>
-        </w:rPr>
-        <w:t>are able to</w:t>
-      </w:r>
-      <w:proofErr w:type="gramEnd"/>
-      <w:r>
-        <w:rPr>
-          <w:sz w:val="22"/>
-          <w:szCs w:val="22"/>
-        </w:rPr>
-        <w:t xml:space="preserve"> see the real time measurements of distance together with a chart to easily see any outliers.</w:t>
-      </w:r>
-    </w:p>
-    <w:p>
-      <w:pPr>
-        <w:pStyle w:val="Heading2"/>
+        <w:t>This document specifies the requirements for the Rangefinder, a Raspberry PI based range-finding tool with a mobile phone app user interface. Its users are able to see the real time measurements of distance together with a chart to easily see any outliers.</w:t>
+      </w:r>
+    </w:p>
+    <w:p>
+      <w:pPr>
+        <w:pStyle w:val="Nadpis2"/>
         <w:keepNext w:val="0"/>
         <w:keepLines w:val="0"/>
         <w:spacing w:after="80"/>
@@ -229,6 +213,9 @@
       <w:r>
         <w:t>RF – shortcut for Rangefinder</w:t>
       </w:r>
+      <w:r>
+        <w:t xml:space="preserve"> – mobile application</w:t>
+      </w:r>
     </w:p>
     <w:p>
       <w:pPr>
@@ -239,7 +226,10 @@
         <w:spacing w:after="240"/>
       </w:pPr>
       <w:r>
-        <w:t>RPi – shortcut for Raspberry PI</w:t>
+        <w:t>RPi – shortcut for Raspberry P</w:t>
+      </w:r>
+      <w:r>
+        <w:t>i</w:t>
       </w:r>
     </w:p>
     <w:p>
@@ -274,7 +264,7 @@
     </w:p>
     <w:p>
       <w:pPr>
-        <w:pStyle w:val="Heading2"/>
+        <w:pStyle w:val="Nadpis2"/>
         <w:keepNext w:val="0"/>
         <w:keepLines w:val="0"/>
         <w:spacing w:after="80"/>
@@ -385,21 +375,19 @@
     </w:p>
     <w:p>
       <w:r>
-        <w:t xml:space="preserve">The Rangefinder provides a real time measurement of distance from the sensors mounted on the Raspberry PI, that are transmitted by </w:t>
+        <w:t>The Rangefinder provides a real time measurement of distance from the sensors mounted on the Raspberry P</w:t>
+      </w:r>
+      <w:r>
+        <w:t>i</w:t>
+      </w:r>
+      <w:r>
+        <w:t xml:space="preserve">, that are transmitted by </w:t>
       </w:r>
       <w:r>
         <w:t>Bluetooth</w:t>
       </w:r>
       <w:r>
-        <w:t xml:space="preserve"> to a mobile phone app. Once the user pairs his app to the gadget, he will be able to see measurements of each sensor, the chart showing the measurements in </w:t>
-      </w:r>
-      <w:proofErr w:type="gramStart"/>
-      <w:r>
-        <w:t>a time period</w:t>
-      </w:r>
-      <w:proofErr w:type="gramEnd"/>
-      <w:r>
-        <w:t xml:space="preserve"> and a debug window </w:t>
+        <w:t xml:space="preserve"> to a mobile phone app. Once the user pairs his app to the gadget, he will be able to see measurements of each sensor, the chart showing the measurements in a time period and a debug window </w:t>
       </w:r>
       <w:r>
         <w:t>of</w:t>
@@ -460,13 +448,19 @@
     </w:p>
     <w:p>
       <w:r>
-        <w:t>Raspberry PI: https://www.raspberrypi.com</w:t>
+        <w:t>Raspberry P</w:t>
+      </w:r>
+      <w:r>
+        <w:t>i</w:t>
+      </w:r>
+      <w:r>
+        <w:t>: https://www.raspberrypi.com</w:t>
       </w:r>
     </w:p>
     <w:p/>
     <w:p>
       <w:pPr>
-        <w:pStyle w:val="Heading1"/>
+        <w:pStyle w:val="Nadpis1"/>
         <w:keepNext w:val="0"/>
         <w:keepLines w:val="0"/>
         <w:spacing w:before="240" w:after="240"/>
@@ -491,7 +485,7 @@
     </w:p>
     <w:p>
       <w:pPr>
-        <w:pStyle w:val="Heading2"/>
+        <w:pStyle w:val="Nadpis2"/>
         <w:keepNext w:val="0"/>
         <w:keepLines w:val="0"/>
         <w:spacing w:after="80"/>
@@ -575,7 +569,7 @@
     </w:p>
     <w:p>
       <w:pPr>
-        <w:pStyle w:val="Heading2"/>
+        <w:pStyle w:val="Nadpis2"/>
         <w:keepNext w:val="0"/>
         <w:keepLines w:val="0"/>
         <w:spacing w:after="80"/>
@@ -600,7 +594,7 @@
     </w:p>
     <w:p>
       <w:pPr>
-        <w:pStyle w:val="Heading2"/>
+        <w:pStyle w:val="Nadpis2"/>
         <w:keepNext w:val="0"/>
         <w:keepLines w:val="0"/>
         <w:numPr>
@@ -664,7 +658,7 @@
     </w:p>
     <w:p>
       <w:pPr>
-        <w:pStyle w:val="Heading2"/>
+        <w:pStyle w:val="Nadpis2"/>
         <w:keepNext w:val="0"/>
         <w:keepLines w:val="0"/>
         <w:spacing w:after="80"/>
@@ -698,7 +692,7 @@
     </w:p>
     <w:p>
       <w:pPr>
-        <w:pStyle w:val="Heading2"/>
+        <w:pStyle w:val="Nadpis2"/>
         <w:keepNext w:val="0"/>
         <w:keepLines w:val="0"/>
         <w:spacing w:after="80"/>
@@ -721,10 +715,9 @@
         <w:t>2.4     Operating Environment</w:t>
       </w:r>
     </w:p>
-    <w:p/>
-    <w:p>
-      <w:pPr>
-        <w:pStyle w:val="ListParagraph"/>
+    <w:p>
+      <w:pPr>
+        <w:pStyle w:val="Odstavecseseznamem"/>
         <w:numPr>
           <w:ilvl w:val="0"/>
           <w:numId w:val="13"/>
@@ -738,12 +731,60 @@
         <w:rPr>
           <w:color w:val="000000" w:themeColor="text1"/>
         </w:rPr>
-        <w:t>Raspberry PI zero 2 – Raspberrian Lite, Thonny IDE</w:t>
-      </w:r>
-    </w:p>
-    <w:p>
-      <w:pPr>
-        <w:pStyle w:val="ListParagraph"/>
+        <w:t>Raspberry P</w:t>
+      </w:r>
+      <w:r>
+        <w:rPr>
+          <w:color w:val="000000" w:themeColor="text1"/>
+        </w:rPr>
+        <w:t>i</w:t>
+      </w:r>
+      <w:r>
+        <w:rPr>
+          <w:color w:val="000000" w:themeColor="text1"/>
+        </w:rPr>
+        <w:t xml:space="preserve"> </w:t>
+      </w:r>
+      <w:r>
+        <w:rPr>
+          <w:color w:val="000000" w:themeColor="text1"/>
+        </w:rPr>
+        <w:t>Z</w:t>
+      </w:r>
+      <w:r>
+        <w:rPr>
+          <w:color w:val="000000" w:themeColor="text1"/>
+        </w:rPr>
+        <w:t>ero 2</w:t>
+      </w:r>
+      <w:r>
+        <w:rPr>
+          <w:color w:val="000000" w:themeColor="text1"/>
+        </w:rPr>
+        <w:t>W</w:t>
+      </w:r>
+      <w:r>
+        <w:rPr>
+          <w:color w:val="000000" w:themeColor="text1"/>
+        </w:rPr>
+        <w:t xml:space="preserve"> – Rasp</w:t>
+      </w:r>
+      <w:r>
+        <w:rPr>
+          <w:color w:val="000000" w:themeColor="text1"/>
+        </w:rPr>
+        <w:t>bian</w:t>
+      </w:r>
+      <w:r>
+        <w:rPr>
+          <w:color w:val="000000" w:themeColor="text1"/>
+        </w:rPr>
+        <w:t xml:space="preserve"> Lite </w:t>
+      </w:r>
+    </w:p>
+    <w:p>
+      <w:pPr>
+        <w:pStyle w:val="Odstavecseseznamem"/>
         <w:numPr>
           <w:ilvl w:val="0"/>
           <w:numId w:val="13"/>
@@ -757,13 +798,18 @@
         <w:rPr>
           <w:color w:val="000000" w:themeColor="text1"/>
         </w:rPr>
-        <w:lastRenderedPageBreak/>
         <w:t>Android</w:t>
       </w:r>
-    </w:p>
-    <w:p>
-      <w:pPr>
-        <w:pStyle w:val="Heading2"/>
+      <w:r>
+        <w:rPr>
+          <w:color w:val="000000" w:themeColor="text1"/>
+        </w:rPr>
+        <w:t xml:space="preserve"> operating system</w:t>
+      </w:r>
+    </w:p>
+    <w:p>
+      <w:pPr>
+        <w:pStyle w:val="Nadpis2"/>
         <w:keepNext w:val="0"/>
         <w:keepLines w:val="0"/>
         <w:spacing w:after="80"/>
@@ -783,12 +829,13 @@
           <w:sz w:val="26"/>
           <w:szCs w:val="26"/>
         </w:rPr>
+        <w:lastRenderedPageBreak/>
         <w:t>2.5     Design and Implementation Constraints</w:t>
       </w:r>
     </w:p>
     <w:p>
       <w:pPr>
-        <w:pStyle w:val="ListParagraph"/>
+        <w:pStyle w:val="Odstavecseseznamem"/>
         <w:numPr>
           <w:ilvl w:val="0"/>
           <w:numId w:val="14"/>
@@ -819,7 +866,7 @@
     </w:p>
     <w:p>
       <w:pPr>
-        <w:pStyle w:val="Heading2"/>
+        <w:pStyle w:val="Nadpis2"/>
         <w:keepNext w:val="0"/>
         <w:keepLines w:val="0"/>
         <w:spacing w:after="80"/>
@@ -842,7 +889,6 @@
         <w:t>2.6     User Documentation</w:t>
       </w:r>
     </w:p>
-    <w:p/>
     <w:p>
       <w:pPr>
         <w:numPr>
@@ -879,7 +925,7 @@
     <w:p/>
     <w:p>
       <w:pPr>
-        <w:pStyle w:val="Heading2"/>
+        <w:pStyle w:val="Nadpis2"/>
         <w:keepNext w:val="0"/>
         <w:keepLines w:val="0"/>
         <w:spacing w:after="80"/>
@@ -902,7 +948,6 @@
         <w:t>2.7     Assumptions and Dependencies</w:t>
       </w:r>
     </w:p>
-    <w:p/>
     <w:p>
       <w:pPr>
         <w:numPr>
@@ -917,7 +962,7 @@
     </w:p>
     <w:p>
       <w:pPr>
-        <w:pStyle w:val="Heading1"/>
+        <w:pStyle w:val="Nadpis1"/>
         <w:keepNext w:val="0"/>
         <w:keepLines w:val="0"/>
         <w:spacing w:before="480"/>
@@ -942,7 +987,7 @@
     </w:p>
     <w:p>
       <w:pPr>
-        <w:pStyle w:val="Heading2"/>
+        <w:pStyle w:val="Nadpis2"/>
         <w:keepNext w:val="0"/>
         <w:keepLines w:val="0"/>
         <w:spacing w:after="80"/>
@@ -960,7 +1005,7 @@
           <w:sz w:val="26"/>
           <w:szCs w:val="26"/>
         </w:rPr>
-        <w:t>3.1     Use-case diagrams</w:t>
+        <w:t>3.1     Use-case diagram</w:t>
       </w:r>
     </w:p>
     <w:p>
@@ -973,6 +1018,7 @@
       </w:pPr>
       <w:r>
         <w:rPr>
+          <w:noProof/>
           <w:sz w:val="24"/>
           <w:szCs w:val="24"/>
         </w:rPr>
@@ -1030,16 +1076,7 @@
     </w:p>
     <w:p>
       <w:pPr>
-        <w:jc w:val="both"/>
-        <w:rPr>
-          <w:sz w:val="24"/>
-          <w:szCs w:val="24"/>
-        </w:rPr>
-      </w:pPr>
-    </w:p>
-    <w:p>
-      <w:pPr>
-        <w:pStyle w:val="Heading2"/>
+        <w:pStyle w:val="Nadpis2"/>
         <w:keepNext w:val="0"/>
         <w:keepLines w:val="0"/>
         <w:spacing w:after="80"/>
@@ -1059,12 +1096,13 @@
           <w:sz w:val="26"/>
           <w:szCs w:val="26"/>
         </w:rPr>
+        <w:lastRenderedPageBreak/>
         <w:t>3.2     Scenarios</w:t>
       </w:r>
     </w:p>
     <w:p>
       <w:pPr>
-        <w:pStyle w:val="Heading2"/>
+        <w:pStyle w:val="Nadpis2"/>
         <w:keepNext w:val="0"/>
         <w:keepLines w:val="0"/>
         <w:spacing w:after="80"/>
@@ -1116,20 +1154,6 @@
           <w:szCs w:val="26"/>
         </w:rPr>
         <w:t>distance to an object</w:t>
-      </w:r>
-    </w:p>
-    <w:p>
-      <w:pPr>
-        <w:spacing w:before="240" w:after="240"/>
-        <w:jc w:val="both"/>
-      </w:pPr>
-      <w:r>
-        <w:rPr>
-          <w:color w:val="1155CC"/>
-          <w:sz w:val="24"/>
-          <w:szCs w:val="24"/>
-        </w:rPr>
-        <w:t xml:space="preserve"> </w:t>
       </w:r>
     </w:p>
     <w:tbl>
@@ -2243,7 +2267,7 @@
     </w:tbl>
     <w:p>
       <w:pPr>
-        <w:pStyle w:val="Heading3"/>
+        <w:pStyle w:val="Nadpis3"/>
         <w:rPr>
           <w:color w:val="000000" w:themeColor="text1"/>
         </w:rPr>
@@ -2280,7 +2304,7 @@
     </w:p>
     <w:p>
       <w:pPr>
-        <w:pStyle w:val="ListParagraph"/>
+        <w:pStyle w:val="Odstavecseseznamem"/>
         <w:numPr>
           <w:ilvl w:val="0"/>
           <w:numId w:val="14"/>
@@ -2292,7 +2316,7 @@
     </w:p>
     <w:p>
       <w:pPr>
-        <w:pStyle w:val="ListParagraph"/>
+        <w:pStyle w:val="Odstavecseseznamem"/>
         <w:numPr>
           <w:ilvl w:val="0"/>
           <w:numId w:val="14"/>
@@ -2304,7 +2328,7 @@
     </w:p>
     <w:p>
       <w:pPr>
-        <w:pStyle w:val="ListParagraph"/>
+        <w:pStyle w:val="Odstavecseseznamem"/>
         <w:numPr>
           <w:ilvl w:val="0"/>
           <w:numId w:val="14"/>
@@ -2321,7 +2345,7 @@
     </w:p>
     <w:p>
       <w:pPr>
-        <w:pStyle w:val="ListParagraph"/>
+        <w:pStyle w:val="Odstavecseseznamem"/>
         <w:numPr>
           <w:ilvl w:val="0"/>
           <w:numId w:val="16"/>
@@ -2333,7 +2357,7 @@
     </w:p>
     <w:p>
       <w:pPr>
-        <w:pStyle w:val="ListParagraph"/>
+        <w:pStyle w:val="Odstavecseseznamem"/>
         <w:numPr>
           <w:ilvl w:val="0"/>
           <w:numId w:val="16"/>
@@ -2345,22 +2369,14 @@
     </w:p>
     <w:p>
       <w:pPr>
-        <w:pStyle w:val="ListParagraph"/>
+        <w:pStyle w:val="Odstavecseseznamem"/>
         <w:numPr>
           <w:ilvl w:val="0"/>
           <w:numId w:val="16"/>
         </w:numPr>
       </w:pPr>
       <w:r>
-        <w:t xml:space="preserve">Result: User </w:t>
-      </w:r>
-      <w:proofErr w:type="gramStart"/>
-      <w:r>
-        <w:t>has to</w:t>
-      </w:r>
-      <w:proofErr w:type="gramEnd"/>
-      <w:r>
-        <w:t xml:space="preserve"> reconnect his BT connection</w:t>
+        <w:t>Result: User has to reconnect his BT connection</w:t>
       </w:r>
     </w:p>
     <w:p>
@@ -2377,14 +2393,14 @@
     </w:p>
     <w:p>
       <w:pPr>
-        <w:pStyle w:val="Heading4"/>
+        <w:pStyle w:val="Nadpis4"/>
         <w:spacing w:before="240" w:after="240"/>
         <w:jc w:val="both"/>
       </w:pPr>
     </w:p>
     <w:p>
       <w:pPr>
-        <w:pStyle w:val="Heading3"/>
+        <w:pStyle w:val="Nadpis3"/>
         <w:keepNext w:val="0"/>
         <w:keepLines w:val="0"/>
         <w:spacing w:before="280"/>
@@ -3614,7 +3630,7 @@
     </w:tbl>
     <w:p>
       <w:pPr>
-        <w:pStyle w:val="Heading4"/>
+        <w:pStyle w:val="Nadpis4"/>
         <w:spacing w:before="240" w:after="240"/>
         <w:jc w:val="both"/>
         <w:rPr>
@@ -3638,7 +3654,7 @@
     </w:p>
     <w:p>
       <w:pPr>
-        <w:pStyle w:val="ListParagraph"/>
+        <w:pStyle w:val="Odstavecseseznamem"/>
         <w:numPr>
           <w:ilvl w:val="0"/>
           <w:numId w:val="17"/>
@@ -3650,7 +3666,7 @@
     </w:p>
     <w:p>
       <w:pPr>
-        <w:pStyle w:val="ListParagraph"/>
+        <w:pStyle w:val="Odstavecseseznamem"/>
         <w:numPr>
           <w:ilvl w:val="0"/>
           <w:numId w:val="17"/>
@@ -3662,7 +3678,7 @@
     </w:p>
     <w:p>
       <w:pPr>
-        <w:pStyle w:val="ListParagraph"/>
+        <w:pStyle w:val="Odstavecseseznamem"/>
         <w:numPr>
           <w:ilvl w:val="0"/>
           <w:numId w:val="17"/>
@@ -3675,7 +3691,7 @@
     <w:p/>
     <w:p>
       <w:pPr>
-        <w:pStyle w:val="Heading3"/>
+        <w:pStyle w:val="Nadpis3"/>
         <w:keepNext w:val="0"/>
         <w:keepLines w:val="0"/>
         <w:spacing w:before="280"/>
@@ -4987,7 +5003,7 @@
     </w:tbl>
     <w:p>
       <w:pPr>
-        <w:pStyle w:val="Heading3"/>
+        <w:pStyle w:val="Nadpis3"/>
         <w:keepNext w:val="0"/>
         <w:keepLines w:val="0"/>
         <w:spacing w:before="280"/>
@@ -5021,7 +5037,7 @@
     </w:p>
     <w:p>
       <w:pPr>
-        <w:pStyle w:val="ListParagraph"/>
+        <w:pStyle w:val="Odstavecseseznamem"/>
         <w:numPr>
           <w:ilvl w:val="0"/>
           <w:numId w:val="14"/>
@@ -5039,7 +5055,7 @@
     </w:p>
     <w:p>
       <w:pPr>
-        <w:pStyle w:val="ListParagraph"/>
+        <w:pStyle w:val="Odstavecseseznamem"/>
         <w:numPr>
           <w:ilvl w:val="0"/>
           <w:numId w:val="14"/>
@@ -5057,7 +5073,7 @@
     </w:p>
     <w:p>
       <w:pPr>
-        <w:pStyle w:val="ListParagraph"/>
+        <w:pStyle w:val="Odstavecseseznamem"/>
         <w:numPr>
           <w:ilvl w:val="0"/>
           <w:numId w:val="14"/>
@@ -5077,7 +5093,7 @@
     </w:p>
     <w:p>
       <w:pPr>
-        <w:pStyle w:val="ListParagraph"/>
+        <w:pStyle w:val="Odstavecseseznamem"/>
         <w:numPr>
           <w:ilvl w:val="0"/>
           <w:numId w:val="18"/>
@@ -5089,7 +5105,7 @@
     </w:p>
     <w:p>
       <w:pPr>
-        <w:pStyle w:val="ListParagraph"/>
+        <w:pStyle w:val="Odstavecseseznamem"/>
         <w:numPr>
           <w:ilvl w:val="0"/>
           <w:numId w:val="18"/>
@@ -5101,7 +5117,7 @@
     </w:p>
     <w:p>
       <w:pPr>
-        <w:pStyle w:val="ListParagraph"/>
+        <w:pStyle w:val="Odstavecseseznamem"/>
         <w:numPr>
           <w:ilvl w:val="0"/>
           <w:numId w:val="18"/>
@@ -6355,7 +6371,7 @@
     </w:tbl>
     <w:p>
       <w:pPr>
-        <w:pStyle w:val="Heading3"/>
+        <w:pStyle w:val="Nadpis3"/>
       </w:pPr>
       <w:r>
         <w:t>Alternative flows</w:t>
@@ -6368,7 +6384,7 @@
     </w:p>
     <w:p>
       <w:pPr>
-        <w:pStyle w:val="ListParagraph"/>
+        <w:pStyle w:val="Odstavecseseznamem"/>
         <w:numPr>
           <w:ilvl w:val="0"/>
           <w:numId w:val="19"/>
@@ -6380,7 +6396,7 @@
     </w:p>
     <w:p>
       <w:pPr>
-        <w:pStyle w:val="ListParagraph"/>
+        <w:pStyle w:val="Odstavecseseznamem"/>
         <w:numPr>
           <w:ilvl w:val="0"/>
           <w:numId w:val="19"/>
@@ -6392,7 +6408,7 @@
     </w:p>
     <w:p>
       <w:pPr>
-        <w:pStyle w:val="ListParagraph"/>
+        <w:pStyle w:val="Odstavecseseznamem"/>
         <w:numPr>
           <w:ilvl w:val="0"/>
           <w:numId w:val="19"/>
@@ -6605,14 +6621,7 @@
                 <w:sz w:val="24"/>
                 <w:szCs w:val="24"/>
               </w:rPr>
-              <w:t>FREQ-</w:t>
-            </w:r>
-            <w:r>
-              <w:rPr>
-                <w:sz w:val="24"/>
-                <w:szCs w:val="24"/>
-              </w:rPr>
-              <w:t>9, FREQ-2, FREQ-3</w:t>
+              <w:t>FREQ-9, FREQ-2, FREQ-3</w:t>
             </w:r>
           </w:p>
         </w:tc>
@@ -7625,21 +7634,7 @@
                 <w:sz w:val="24"/>
                 <w:szCs w:val="24"/>
               </w:rPr>
-              <w:t>FREQ-</w:t>
-            </w:r>
-            <w:r>
-              <w:rPr>
-                <w:sz w:val="24"/>
-                <w:szCs w:val="24"/>
-              </w:rPr>
-              <w:t>10</w:t>
-            </w:r>
-            <w:r>
-              <w:rPr>
-                <w:sz w:val="24"/>
-                <w:szCs w:val="24"/>
-              </w:rPr>
-              <w:t>, FREQ-2, FREQ-3</w:t>
+              <w:t>FREQ-10, FREQ-2, FREQ-3</w:t>
             </w:r>
           </w:p>
         </w:tc>
@@ -8452,7 +8447,7 @@
     </w:tbl>
     <w:p>
       <w:pPr>
-        <w:pStyle w:val="Heading3"/>
+        <w:pStyle w:val="Nadpis3"/>
         <w:rPr>
           <w:color w:val="000000" w:themeColor="text1"/>
         </w:rPr>
@@ -8471,7 +8466,7 @@
     </w:p>
     <w:p>
       <w:pPr>
-        <w:pStyle w:val="ListParagraph"/>
+        <w:pStyle w:val="Odstavecseseznamem"/>
         <w:numPr>
           <w:ilvl w:val="0"/>
           <w:numId w:val="21"/>
@@ -8483,7 +8478,7 @@
     </w:p>
     <w:p>
       <w:pPr>
-        <w:pStyle w:val="ListParagraph"/>
+        <w:pStyle w:val="Odstavecseseznamem"/>
         <w:numPr>
           <w:ilvl w:val="0"/>
           <w:numId w:val="21"/>
@@ -8495,7 +8490,7 @@
     </w:p>
     <w:p>
       <w:pPr>
-        <w:pStyle w:val="ListParagraph"/>
+        <w:pStyle w:val="Odstavecseseznamem"/>
         <w:numPr>
           <w:ilvl w:val="0"/>
           <w:numId w:val="21"/>
@@ -8526,7 +8521,7 @@
     </w:p>
     <w:p>
       <w:pPr>
-        <w:pStyle w:val="Heading2"/>
+        <w:pStyle w:val="Nadpis2"/>
         <w:keepNext w:val="0"/>
         <w:keepLines w:val="0"/>
         <w:spacing w:after="80"/>
@@ -8547,7 +8542,7 @@
     </w:p>
     <w:p>
       <w:pPr>
-        <w:pStyle w:val="Heading2"/>
+        <w:pStyle w:val="Nadpis2"/>
         <w:keepNext w:val="0"/>
         <w:keepLines w:val="0"/>
         <w:spacing w:after="80"/>
@@ -8636,15 +8631,7 @@
         <w:t>Bluetooth</w:t>
       </w:r>
       <w:r>
-        <w:t xml:space="preserve"> is working correctly on both devices, the user </w:t>
-      </w:r>
-      <w:proofErr w:type="gramStart"/>
-      <w:r>
-        <w:t>is able to</w:t>
-      </w:r>
-      <w:proofErr w:type="gramEnd"/>
-      <w:r>
-        <w:t xml:space="preserve"> connect to the </w:t>
+        <w:t xml:space="preserve"> is working correctly on both devices, the user is able to connect to the </w:t>
       </w:r>
       <w:r>
         <w:t>SeS</w:t>
@@ -8655,7 +8642,7 @@
     </w:p>
     <w:p>
       <w:pPr>
-        <w:pStyle w:val="Heading2"/>
+        <w:pStyle w:val="Nadpis2"/>
         <w:keepNext w:val="0"/>
         <w:keepLines w:val="0"/>
         <w:spacing w:after="80"/>
@@ -8731,7 +8718,7 @@
     </w:p>
     <w:p>
       <w:pPr>
-        <w:pStyle w:val="Heading2"/>
+        <w:pStyle w:val="Nadpis2"/>
         <w:keepNext w:val="0"/>
         <w:keepLines w:val="0"/>
         <w:spacing w:after="80"/>
@@ -8802,15 +8789,7 @@
         <w:t>SeS</w:t>
       </w:r>
       <w:r>
-        <w:t xml:space="preserve">, they can see the chart in the “Advanced” menu of the </w:t>
-      </w:r>
-      <w:proofErr w:type="gramStart"/>
-      <w:r>
-        <w:t>app</w:t>
-      </w:r>
-      <w:proofErr w:type="gramEnd"/>
-      <w:r>
-        <w:t xml:space="preserve"> and they can distinguish each sensor by their assigned </w:t>
+        <w:t xml:space="preserve">, they can see the chart in the “Advanced” menu of the app and they can distinguish each sensor by their assigned </w:t>
       </w:r>
       <w:r>
         <w:t>colour</w:t>
@@ -8821,7 +8800,7 @@
     </w:p>
     <w:p>
       <w:pPr>
-        <w:pStyle w:val="Heading2"/>
+        <w:pStyle w:val="Nadpis2"/>
         <w:keepNext w:val="0"/>
         <w:keepLines w:val="0"/>
         <w:spacing w:after="80"/>
@@ -8903,7 +8882,7 @@
     </w:p>
     <w:p>
       <w:pPr>
-        <w:pStyle w:val="Heading2"/>
+        <w:pStyle w:val="Nadpis2"/>
         <w:keepNext w:val="0"/>
         <w:keepLines w:val="0"/>
         <w:spacing w:after="80"/>
@@ -9011,7 +8990,7 @@
     </w:p>
     <w:p>
       <w:pPr>
-        <w:pStyle w:val="Heading2"/>
+        <w:pStyle w:val="Nadpis2"/>
         <w:keepNext w:val="0"/>
         <w:keepLines w:val="0"/>
         <w:spacing w:after="80"/>
@@ -9056,25 +9035,7 @@
           <w:sz w:val="26"/>
           <w:szCs w:val="26"/>
         </w:rPr>
-        <w:t>6</w:t>
-      </w:r>
-      <w:r>
-        <w:rPr>
-          <w:b/>
-          <w:bCs/>
-          <w:sz w:val="26"/>
-          <w:szCs w:val="26"/>
-        </w:rPr>
-        <w:t xml:space="preserve"> – </w:t>
-      </w:r>
-      <w:r>
-        <w:rPr>
-          <w:b/>
-          <w:bCs/>
-          <w:sz w:val="26"/>
-          <w:szCs w:val="26"/>
-        </w:rPr>
-        <w:t>Receiving data</w:t>
+        <w:t>6 – Receiving data</w:t>
       </w:r>
     </w:p>
     <w:p>
@@ -9089,10 +9050,7 @@
         <w:t xml:space="preserve">Description: </w:t>
       </w:r>
       <w:r>
-        <w:t xml:space="preserve">The Rangefinder </w:t>
-      </w:r>
-      <w:r>
-        <w:t>app shall correctly receive data, that are being sent through the Bluetooth connection</w:t>
+        <w:t>The Rangefinder app shall correctly receive data, that are being sent through the Bluetooth connection</w:t>
       </w:r>
     </w:p>
     <w:p>
@@ -9134,20 +9092,12 @@
         <w:t>SeS</w:t>
       </w:r>
       <w:r>
-        <w:t xml:space="preserve"> are received and </w:t>
-      </w:r>
-      <w:proofErr w:type="gramStart"/>
-      <w:r>
-        <w:t>are able to</w:t>
-      </w:r>
-      <w:proofErr w:type="gramEnd"/>
-      <w:r>
-        <w:t xml:space="preserve"> be used</w:t>
-      </w:r>
-    </w:p>
-    <w:p>
-      <w:pPr>
-        <w:pStyle w:val="Heading2"/>
+        <w:t xml:space="preserve"> are received and are able to be used</w:t>
+      </w:r>
+    </w:p>
+    <w:p>
+      <w:pPr>
+        <w:pStyle w:val="Nadpis2"/>
         <w:keepNext w:val="0"/>
         <w:keepLines w:val="0"/>
         <w:spacing w:after="80"/>
@@ -9192,25 +9142,7 @@
           <w:sz w:val="26"/>
           <w:szCs w:val="26"/>
         </w:rPr>
-        <w:t>7</w:t>
-      </w:r>
-      <w:r>
-        <w:rPr>
-          <w:b/>
-          <w:bCs/>
-          <w:sz w:val="26"/>
-          <w:szCs w:val="26"/>
-        </w:rPr>
-        <w:t xml:space="preserve"> – </w:t>
-      </w:r>
-      <w:r>
-        <w:rPr>
-          <w:b/>
-          <w:bCs/>
-          <w:sz w:val="26"/>
-          <w:szCs w:val="26"/>
-        </w:rPr>
-        <w:t>Detecting and measuring distances of objects</w:t>
+        <w:t>7 – Detecting and measuring distances of objects</w:t>
       </w:r>
     </w:p>
     <w:p>
@@ -9275,7 +9207,7 @@
     </w:p>
     <w:p>
       <w:pPr>
-        <w:pStyle w:val="Heading2"/>
+        <w:pStyle w:val="Nadpis2"/>
         <w:keepNext w:val="0"/>
         <w:keepLines w:val="0"/>
         <w:spacing w:after="80"/>
@@ -9320,25 +9252,7 @@
           <w:sz w:val="26"/>
           <w:szCs w:val="26"/>
         </w:rPr>
-        <w:t>8</w:t>
-      </w:r>
-      <w:r>
-        <w:rPr>
-          <w:b/>
-          <w:bCs/>
-          <w:sz w:val="26"/>
-          <w:szCs w:val="26"/>
-        </w:rPr>
-        <w:t xml:space="preserve"> – </w:t>
-      </w:r>
-      <w:r>
-        <w:rPr>
-          <w:b/>
-          <w:bCs/>
-          <w:sz w:val="26"/>
-          <w:szCs w:val="26"/>
-        </w:rPr>
-        <w:t>Disconnecting from SeS</w:t>
+        <w:t>8 – Disconnecting from SeS</w:t>
       </w:r>
     </w:p>
     <w:p>
@@ -9353,10 +9267,7 @@
         <w:t xml:space="preserve">Description: </w:t>
       </w:r>
       <w:r>
-        <w:t xml:space="preserve">The </w:t>
-      </w:r>
-      <w:r>
-        <w:t>app shall allow the user to disconnect from the SeS</w:t>
+        <w:t>The app shall allow the user to disconnect from the SeS</w:t>
       </w:r>
     </w:p>
     <w:p>
@@ -9397,7 +9308,7 @@
     </w:p>
     <w:p>
       <w:pPr>
-        <w:pStyle w:val="Heading2"/>
+        <w:pStyle w:val="Nadpis2"/>
         <w:keepNext w:val="0"/>
         <w:keepLines w:val="0"/>
         <w:spacing w:after="80"/>
@@ -9442,7 +9353,7 @@
           <w:sz w:val="26"/>
           <w:szCs w:val="26"/>
         </w:rPr>
-        <w:t>9</w:t>
+        <w:t xml:space="preserve">9 – Configuring </w:t>
       </w:r>
       <w:r>
         <w:rPr>
@@ -9451,24 +9362,6 @@
           <w:sz w:val="26"/>
           <w:szCs w:val="26"/>
         </w:rPr>
-        <w:t xml:space="preserve"> – </w:t>
-      </w:r>
-      <w:r>
-        <w:rPr>
-          <w:b/>
-          <w:bCs/>
-          <w:sz w:val="26"/>
-          <w:szCs w:val="26"/>
-        </w:rPr>
-        <w:t xml:space="preserve">Configuring </w:t>
-      </w:r>
-      <w:r>
-        <w:rPr>
-          <w:b/>
-          <w:bCs/>
-          <w:sz w:val="26"/>
-          <w:szCs w:val="26"/>
-        </w:rPr>
         <w:t>units of measurement</w:t>
       </w:r>
     </w:p>
@@ -9484,10 +9377,7 @@
         <w:t xml:space="preserve">Description: </w:t>
       </w:r>
       <w:r>
-        <w:t xml:space="preserve">The app shall allow the user to </w:t>
-      </w:r>
-      <w:r>
-        <w:t xml:space="preserve">configure measurement </w:t>
+        <w:t xml:space="preserve">The app shall allow the user to configure measurement </w:t>
       </w:r>
       <w:r>
         <w:t xml:space="preserve">units </w:t>
@@ -9534,7 +9424,7 @@
     </w:p>
     <w:p>
       <w:pPr>
-        <w:pStyle w:val="Heading2"/>
+        <w:pStyle w:val="Nadpis2"/>
         <w:keepNext w:val="0"/>
         <w:keepLines w:val="0"/>
         <w:spacing w:after="80"/>
@@ -9579,25 +9469,7 @@
           <w:sz w:val="26"/>
           <w:szCs w:val="26"/>
         </w:rPr>
-        <w:t>10</w:t>
-      </w:r>
-      <w:r>
-        <w:rPr>
-          <w:b/>
-          <w:bCs/>
-          <w:sz w:val="26"/>
-          <w:szCs w:val="26"/>
-        </w:rPr>
-        <w:t xml:space="preserve"> – Configuring </w:t>
-      </w:r>
-      <w:r>
-        <w:rPr>
-          <w:b/>
-          <w:bCs/>
-          <w:sz w:val="26"/>
-          <w:szCs w:val="26"/>
-        </w:rPr>
-        <w:t>distance threshold</w:t>
+        <w:t>10 – Configuring distance threshold</w:t>
       </w:r>
     </w:p>
     <w:p>
@@ -9612,16 +9484,7 @@
         <w:t xml:space="preserve">Description: </w:t>
       </w:r>
       <w:r>
-        <w:t xml:space="preserve">The app shall allow the user to configure </w:t>
-      </w:r>
-      <w:r>
-        <w:t>distance threshold</w:t>
-      </w:r>
-      <w:r>
-        <w:t xml:space="preserve"> </w:t>
-      </w:r>
-      <w:r>
-        <w:t>in currently chosen units of measurement</w:t>
+        <w:t>The app shall allow the user to configure distance threshold in currently chosen units of measurement</w:t>
       </w:r>
     </w:p>
     <w:p>
@@ -9709,7 +9572,7 @@
     </w:p>
     <w:p>
       <w:pPr>
-        <w:pStyle w:val="Heading2"/>
+        <w:pStyle w:val="Nadpis2"/>
         <w:keepNext w:val="0"/>
         <w:keepLines w:val="0"/>
         <w:spacing w:after="80"/>
@@ -9751,15 +9614,7 @@
         <w:spacing w:before="240" w:after="240"/>
       </w:pPr>
       <w:r>
-        <w:t xml:space="preserve">UI should </w:t>
-      </w:r>
-      <w:proofErr w:type="gramStart"/>
-      <w:r>
-        <w:t>include:</w:t>
-      </w:r>
-      <w:proofErr w:type="gramEnd"/>
-      <w:r>
-        <w:t xml:space="preserve"> Advanced menu, Simple menu</w:t>
+        <w:t>UI should include: Advanced menu, Simple menu</w:t>
       </w:r>
       <w:r>
         <w:t>,</w:t>
@@ -9792,13 +9647,8 @@
         <w:spacing w:before="240" w:after="240"/>
       </w:pPr>
       <w:r>
-        <w:t xml:space="preserve">A chart displaying data of each sensor in a set </w:t>
-      </w:r>
-      <w:proofErr w:type="gramStart"/>
-      <w:r>
-        <w:t>time period</w:t>
-      </w:r>
-      <w:proofErr w:type="gramEnd"/>
+        <w:t>A chart displaying data of each sensor in a set time period</w:t>
+      </w:r>
     </w:p>
     <w:p>
       <w:pPr>
@@ -9901,7 +9751,7 @@
     </w:p>
     <w:p>
       <w:pPr>
-        <w:pStyle w:val="Heading2"/>
+        <w:pStyle w:val="Nadpis2"/>
         <w:keepNext w:val="0"/>
         <w:keepLines w:val="0"/>
         <w:spacing w:after="80"/>
@@ -9926,7 +9776,7 @@
     </w:p>
     <w:p>
       <w:pPr>
-        <w:pStyle w:val="ListParagraph"/>
+        <w:pStyle w:val="Odstavecseseznamem"/>
         <w:numPr>
           <w:ilvl w:val="0"/>
           <w:numId w:val="12"/>
@@ -9964,7 +9814,7 @@
     </w:p>
     <w:p>
       <w:pPr>
-        <w:pStyle w:val="ListParagraph"/>
+        <w:pStyle w:val="Odstavecseseznamem"/>
         <w:numPr>
           <w:ilvl w:val="0"/>
           <w:numId w:val="12"/>
@@ -9978,12 +9828,30 @@
         <w:rPr>
           <w:color w:val="000000" w:themeColor="text1"/>
         </w:rPr>
-        <w:t>Raspberry zero 2w</w:t>
-      </w:r>
-    </w:p>
-    <w:p>
-      <w:pPr>
-        <w:pStyle w:val="ListParagraph"/>
+        <w:t xml:space="preserve">Raspberry </w:t>
+      </w:r>
+      <w:r>
+        <w:rPr>
+          <w:color w:val="000000" w:themeColor="text1"/>
+        </w:rPr>
+        <w:t>Z</w:t>
+      </w:r>
+      <w:r>
+        <w:rPr>
+          <w:color w:val="000000" w:themeColor="text1"/>
+        </w:rPr>
+        <w:t>ero 2</w:t>
+      </w:r>
+      <w:r>
+        <w:rPr>
+          <w:color w:val="000000" w:themeColor="text1"/>
+        </w:rPr>
+        <w:t>W</w:t>
+      </w:r>
+    </w:p>
+    <w:p>
+      <w:pPr>
+        <w:pStyle w:val="Odstavecseseznamem"/>
         <w:numPr>
           <w:ilvl w:val="0"/>
           <w:numId w:val="12"/>
@@ -9993,16 +9861,30 @@
           <w:color w:val="000000" w:themeColor="text1"/>
         </w:rPr>
       </w:pPr>
+      <w:proofErr w:type="spellStart"/>
       <w:r>
         <w:rPr>
           <w:color w:val="000000" w:themeColor="text1"/>
         </w:rPr>
+        <w:t>WaveShare</w:t>
+      </w:r>
+      <w:proofErr w:type="spellEnd"/>
+      <w:r>
+        <w:rPr>
+          <w:color w:val="000000" w:themeColor="text1"/>
+        </w:rPr>
+        <w:t xml:space="preserve"> </w:t>
+      </w:r>
+      <w:r>
+        <w:rPr>
+          <w:color w:val="000000" w:themeColor="text1"/>
+        </w:rPr>
         <w:t>Laser sensor</w:t>
       </w:r>
     </w:p>
     <w:p>
       <w:pPr>
-        <w:pStyle w:val="ListParagraph"/>
+        <w:pStyle w:val="Odstavecseseznamem"/>
         <w:numPr>
           <w:ilvl w:val="0"/>
           <w:numId w:val="12"/>
@@ -10018,10 +9900,16 @@
         </w:rPr>
         <w:t>Ultrasound sensor</w:t>
       </w:r>
-    </w:p>
-    <w:p>
-      <w:pPr>
-        <w:pStyle w:val="ListParagraph"/>
+      <w:r>
+        <w:rPr>
+          <w:color w:val="000000" w:themeColor="text1"/>
+        </w:rPr>
+        <w:t xml:space="preserve"> HC-SR04</w:t>
+      </w:r>
+    </w:p>
+    <w:p>
+      <w:pPr>
+        <w:pStyle w:val="Odstavecseseznamem"/>
         <w:numPr>
           <w:ilvl w:val="0"/>
           <w:numId w:val="12"/>
@@ -10037,6 +9925,12 @@
         </w:rPr>
         <w:t>Time-of-flight sensor</w:t>
       </w:r>
+      <w:r>
+        <w:rPr>
+          <w:color w:val="000000" w:themeColor="text1"/>
+        </w:rPr>
+        <w:t xml:space="preserve"> VL53LDK</w:t>
+      </w:r>
     </w:p>
     <w:p>
       <w:pPr>
@@ -10060,7 +9954,7 @@
     </w:p>
     <w:p>
       <w:pPr>
-        <w:pStyle w:val="ListParagraph"/>
+        <w:pStyle w:val="Odstavecseseznamem"/>
         <w:numPr>
           <w:ilvl w:val="0"/>
           <w:numId w:val="12"/>
@@ -10074,43 +9968,12 @@
         <w:rPr>
           <w:color w:val="000000" w:themeColor="text1"/>
         </w:rPr>
-        <w:t>NA</w:t>
-      </w:r>
-      <w:r>
-        <w:rPr>
-          <w:color w:val="000000" w:themeColor="text1"/>
-        </w:rPr>
-        <w:t xml:space="preserve"> (Bluetooth service)</w:t>
-      </w:r>
-    </w:p>
-    <w:p>
-      <w:pPr>
-        <w:pStyle w:val="Heading2"/>
-        <w:keepNext w:val="0"/>
-        <w:keepLines w:val="0"/>
-        <w:spacing w:after="80"/>
-        <w:rPr>
-          <w:b/>
-          <w:bCs/>
-          <w:sz w:val="26"/>
-          <w:szCs w:val="26"/>
-        </w:rPr>
-      </w:pPr>
-      <w:bookmarkStart w:id="28" w:name="_zd41nxieatow" w:colFirst="0" w:colLast="0"/>
-      <w:bookmarkEnd w:id="28"/>
-      <w:r>
-        <w:rPr>
-          <w:b/>
-          <w:bCs/>
-          <w:sz w:val="26"/>
-          <w:szCs w:val="26"/>
-        </w:rPr>
-        <w:t>5.4     Communications Interfaces</w:t>
-      </w:r>
-    </w:p>
-    <w:p>
-      <w:pPr>
-        <w:pStyle w:val="ListParagraph"/>
+        <w:t>Go Bluetooth – BLE</w:t>
+      </w:r>
+    </w:p>
+    <w:p>
+      <w:pPr>
+        <w:pStyle w:val="Odstavecseseznamem"/>
         <w:numPr>
           <w:ilvl w:val="0"/>
           <w:numId w:val="12"/>
@@ -10126,18 +9989,43 @@
         </w:rPr>
         <w:t>Bluetooth LE plugin for Xa</w:t>
       </w:r>
-      <w:bookmarkStart w:id="29" w:name="_g9bwcblrqp72" w:colFirst="0" w:colLast="0"/>
+      <w:bookmarkStart w:id="28" w:name="_g9bwcblrqp72" w:colFirst="0" w:colLast="0"/>
+      <w:bookmarkEnd w:id="28"/>
+      <w:r>
+        <w:rPr>
+          <w:color w:val="000000" w:themeColor="text1"/>
+        </w:rPr>
+        <w:t>marin &amp; MAUI</w:t>
+      </w:r>
+    </w:p>
+    <w:p>
+      <w:pPr>
+        <w:pStyle w:val="Nadpis2"/>
+        <w:keepNext w:val="0"/>
+        <w:keepLines w:val="0"/>
+        <w:spacing w:after="80"/>
+        <w:rPr>
+          <w:b/>
+          <w:bCs/>
+          <w:sz w:val="26"/>
+          <w:szCs w:val="26"/>
+        </w:rPr>
+      </w:pPr>
+      <w:bookmarkStart w:id="29" w:name="_zd41nxieatow" w:colFirst="0" w:colLast="0"/>
       <w:bookmarkEnd w:id="29"/>
       <w:r>
         <w:rPr>
-          <w:color w:val="000000" w:themeColor="text1"/>
-        </w:rPr>
-        <w:t>marin &amp; MAUI</w:t>
-      </w:r>
-    </w:p>
-    <w:p>
-      <w:pPr>
-        <w:pStyle w:val="ListParagraph"/>
+          <w:b/>
+          <w:bCs/>
+          <w:sz w:val="26"/>
+          <w:szCs w:val="26"/>
+        </w:rPr>
+        <w:t>5.4     Communications Interfaces</w:t>
+      </w:r>
+    </w:p>
+    <w:p>
+      <w:pPr>
+        <w:pStyle w:val="Odstavecseseznamem"/>
         <w:numPr>
           <w:ilvl w:val="0"/>
           <w:numId w:val="12"/>
@@ -10160,16 +10048,10 @@
           <w:color w:val="000000" w:themeColor="text1"/>
         </w:rPr>
       </w:pPr>
-      <w:r>
-        <w:rPr>
-          <w:color w:val="000000" w:themeColor="text1"/>
-        </w:rPr>
-        <w:br w:type="page"/>
-      </w:r>
-    </w:p>
-    <w:p>
-      <w:pPr>
-        <w:pStyle w:val="Heading1"/>
+    </w:p>
+    <w:p>
+      <w:pPr>
+        <w:pStyle w:val="Nadpis1"/>
         <w:keepNext w:val="0"/>
         <w:keepLines w:val="0"/>
         <w:spacing w:before="480"/>
@@ -10211,7 +10093,7 @@
     </w:p>
     <w:p>
       <w:pPr>
-        <w:pStyle w:val="Heading2"/>
+        <w:pStyle w:val="Nadpis2"/>
         <w:keepNext w:val="0"/>
         <w:keepLines w:val="0"/>
         <w:spacing w:after="80"/>
@@ -10241,7 +10123,7 @@
     </w:p>
     <w:p>
       <w:pPr>
-        <w:pStyle w:val="Heading2"/>
+        <w:pStyle w:val="Nadpis2"/>
         <w:keepNext w:val="0"/>
         <w:keepLines w:val="0"/>
         <w:spacing w:after="80"/>
@@ -10274,7 +10156,7 @@
     </w:p>
     <w:p>
       <w:pPr>
-        <w:pStyle w:val="Heading2"/>
+        <w:pStyle w:val="Nadpis2"/>
         <w:keepNext w:val="0"/>
         <w:keepLines w:val="0"/>
         <w:spacing w:after="80"/>
@@ -10299,10 +10181,23 @@
     </w:p>
     <w:p>
       <w:r>
+        <w:t xml:space="preserve">The data transfer between </w:t>
+      </w:r>
+      <w:proofErr w:type="spellStart"/>
+      <w:r>
         <w:t>SeS</w:t>
       </w:r>
-      <w:r>
-        <w:t xml:space="preserve"> shall connect to the phone app using a fixed key, that encrypts the communication.</w:t>
+      <w:proofErr w:type="spellEnd"/>
+      <w:r>
+        <w:t xml:space="preserve"> and RF should be encrypted. For this purpose AES encryption will be used. The data on </w:t>
+      </w:r>
+      <w:proofErr w:type="spellStart"/>
+      <w:r>
+        <w:t>SeS</w:t>
+      </w:r>
+      <w:proofErr w:type="spellEnd"/>
+      <w:r>
+        <w:t xml:space="preserve"> will be encrypted by Secret Key, transmitted safely and then decrypted by the RF.</w:t>
       </w:r>
     </w:p>
     <w:p>
@@ -10379,7 +10274,7 @@
     </w:p>
     <w:p>
       <w:pPr>
-        <w:pStyle w:val="Heading2"/>
+        <w:pStyle w:val="Nadpis2"/>
         <w:keepNext w:val="0"/>
         <w:keepLines w:val="0"/>
         <w:spacing w:after="80"/>
@@ -10422,7 +10317,7 @@
     </w:p>
     <w:p>
       <w:pPr>
-        <w:pStyle w:val="Heading3"/>
+        <w:pStyle w:val="Nadpis3"/>
         <w:keepNext w:val="0"/>
         <w:keepLines w:val="0"/>
         <w:spacing w:before="280"/>
@@ -10444,17 +10339,16 @@
           <w:sz w:val="26"/>
           <w:szCs w:val="26"/>
         </w:rPr>
+        <w:lastRenderedPageBreak/>
         <w:t>7.1 High-Level Architecture</w:t>
       </w:r>
-    </w:p>
-    <w:p>
       <w:r>
         <w:rPr>
           <w:noProof/>
         </w:rPr>
         <w:drawing>
-          <wp:inline distT="0" distB="0" distL="0" distR="0" wp14:anchorId="49B9BE16" wp14:editId="7BC650A3">
-            <wp:extent cx="5852160" cy="3495422"/>
+          <wp:inline distT="0" distB="0" distL="0" distR="0" wp14:anchorId="7BBBDBF2" wp14:editId="5CA43713">
+            <wp:extent cx="6029325" cy="3600847"/>
             <wp:effectExtent l="0" t="0" r="0" b="0"/>
             <wp:docPr id="2035624739" name="Picture 1"/>
             <wp:cNvGraphicFramePr>
@@ -10485,7 +10379,7 @@
                   <pic:spPr bwMode="auto">
                     <a:xfrm>
                       <a:off x="0" y="0"/>
-                      <a:ext cx="5916064" cy="3533591"/>
+                      <a:ext cx="6034151" cy="3603729"/>
                     </a:xfrm>
                     <a:prstGeom prst="rect">
                       <a:avLst/>
@@ -10499,9 +10393,10 @@
         </w:drawing>
       </w:r>
     </w:p>
-    <w:p>
-      <w:pPr>
-        <w:pStyle w:val="Heading3"/>
+    <w:p/>
+    <w:p>
+      <w:pPr>
+        <w:pStyle w:val="Nadpis3"/>
         <w:keepNext w:val="0"/>
         <w:keepLines w:val="0"/>
         <w:spacing w:before="280"/>
@@ -10523,7 +10418,6 @@
           <w:sz w:val="26"/>
           <w:szCs w:val="26"/>
         </w:rPr>
-        <w:lastRenderedPageBreak/>
         <w:t>7.2 Technology Stack</w:t>
       </w:r>
     </w:p>
@@ -10560,18 +10454,315 @@
         <w:rPr>
           <w:color w:val="000000" w:themeColor="text1"/>
         </w:rPr>
-        <w:t xml:space="preserve">Hardware: </w:t>
-      </w:r>
-      <w:r>
+        <w:t>Hardware:</w:t>
+      </w:r>
+    </w:p>
+    <w:p>
+      <w:pPr>
+        <w:numPr>
+          <w:ilvl w:val="1"/>
+          <w:numId w:val="5"/>
+        </w:numPr>
+        <w:spacing w:before="240"/>
         <w:rPr>
           <w:color w:val="000000" w:themeColor="text1"/>
         </w:rPr>
-        <w:t>Golang</w:t>
-      </w:r>
-    </w:p>
-    <w:p>
-      <w:pPr>
-        <w:pStyle w:val="Heading3"/>
+      </w:pPr>
+      <w:r>
+        <w:rPr>
+          <w:color w:val="000000" w:themeColor="text1"/>
+        </w:rPr>
+        <w:t>Main unit: Raspberry Pi Zero 2W</w:t>
+      </w:r>
+    </w:p>
+    <w:p>
+      <w:pPr>
+        <w:numPr>
+          <w:ilvl w:val="2"/>
+          <w:numId w:val="5"/>
+        </w:numPr>
+        <w:spacing w:before="240"/>
+        <w:rPr>
+          <w:color w:val="000000" w:themeColor="text1"/>
+        </w:rPr>
+      </w:pPr>
+      <w:r>
+        <w:rPr>
+          <w:color w:val="000000" w:themeColor="text1"/>
+        </w:rPr>
+        <w:t>ARM64 architecture, 512 MB RAM, integrated BT chip</w:t>
+      </w:r>
+    </w:p>
+    <w:p>
+      <w:pPr>
+        <w:numPr>
+          <w:ilvl w:val="1"/>
+          <w:numId w:val="5"/>
+        </w:numPr>
+        <w:spacing w:before="240"/>
+        <w:rPr>
+          <w:color w:val="000000" w:themeColor="text1"/>
+        </w:rPr>
+      </w:pPr>
+      <w:r>
+        <w:rPr>
+          <w:color w:val="000000" w:themeColor="text1"/>
+        </w:rPr>
+        <w:t>Operating system: Linux (Raspberry Pi OS, 64-bit)</w:t>
+      </w:r>
+    </w:p>
+    <w:p>
+      <w:pPr>
+        <w:numPr>
+          <w:ilvl w:val="1"/>
+          <w:numId w:val="5"/>
+        </w:numPr>
+        <w:spacing w:before="240"/>
+        <w:rPr>
+          <w:color w:val="000000" w:themeColor="text1"/>
+        </w:rPr>
+      </w:pPr>
+      <w:r>
+        <w:rPr>
+          <w:color w:val="000000" w:themeColor="text1"/>
+        </w:rPr>
+        <w:t>Programming language: Go (Golang)</w:t>
+      </w:r>
+    </w:p>
+    <w:p>
+      <w:pPr>
+        <w:numPr>
+          <w:ilvl w:val="1"/>
+          <w:numId w:val="5"/>
+        </w:numPr>
+        <w:spacing w:before="240"/>
+        <w:rPr>
+          <w:color w:val="000000" w:themeColor="text1"/>
+        </w:rPr>
+      </w:pPr>
+      <w:r>
+        <w:rPr>
+          <w:color w:val="000000" w:themeColor="text1"/>
+        </w:rPr>
+        <w:t>Architecture of runtime: Goroutines + Mutex – safe and effective asynchronous parallel processing</w:t>
+      </w:r>
+    </w:p>
+    <w:p>
+      <w:pPr>
+        <w:numPr>
+          <w:ilvl w:val="1"/>
+          <w:numId w:val="5"/>
+        </w:numPr>
+        <w:spacing w:before="240"/>
+        <w:rPr>
+          <w:color w:val="000000" w:themeColor="text1"/>
+        </w:rPr>
+      </w:pPr>
+      <w:r>
+        <w:rPr>
+          <w:color w:val="000000" w:themeColor="text1"/>
+        </w:rPr>
+        <w:t>Key libraries:</w:t>
+      </w:r>
+    </w:p>
+    <w:p>
+      <w:pPr>
+        <w:numPr>
+          <w:ilvl w:val="2"/>
+          <w:numId w:val="5"/>
+        </w:numPr>
+        <w:spacing w:before="240"/>
+        <w:rPr>
+          <w:color w:val="000000" w:themeColor="text1"/>
+        </w:rPr>
+      </w:pPr>
+      <w:r>
+        <w:rPr>
+          <w:color w:val="000000" w:themeColor="text1"/>
+        </w:rPr>
+        <w:t>go-</w:t>
+      </w:r>
+      <w:proofErr w:type="spellStart"/>
+      <w:r>
+        <w:rPr>
+          <w:color w:val="000000" w:themeColor="text1"/>
+        </w:rPr>
+        <w:t>rpio</w:t>
+      </w:r>
+      <w:proofErr w:type="spellEnd"/>
+      <w:r>
+        <w:rPr>
+          <w:color w:val="000000" w:themeColor="text1"/>
+        </w:rPr>
+        <w:t>/v4 : low-level GPIO control</w:t>
+      </w:r>
+    </w:p>
+    <w:p>
+      <w:pPr>
+        <w:numPr>
+          <w:ilvl w:val="2"/>
+          <w:numId w:val="5"/>
+        </w:numPr>
+        <w:spacing w:before="240"/>
+        <w:rPr>
+          <w:color w:val="000000" w:themeColor="text1"/>
+        </w:rPr>
+      </w:pPr>
+      <w:r>
+        <w:rPr>
+          <w:color w:val="000000" w:themeColor="text1"/>
+        </w:rPr>
+        <w:t xml:space="preserve">go-i2c &amp; go-vl5310x : communication with </w:t>
+      </w:r>
+      <w:proofErr w:type="spellStart"/>
+      <w:r>
+        <w:rPr>
+          <w:color w:val="000000" w:themeColor="text1"/>
+        </w:rPr>
+        <w:t>ToF</w:t>
+      </w:r>
+      <w:proofErr w:type="spellEnd"/>
+      <w:r>
+        <w:rPr>
+          <w:color w:val="000000" w:themeColor="text1"/>
+        </w:rPr>
+        <w:t xml:space="preserve"> sensor through HW registry</w:t>
+      </w:r>
+    </w:p>
+    <w:p>
+      <w:pPr>
+        <w:numPr>
+          <w:ilvl w:val="2"/>
+          <w:numId w:val="5"/>
+        </w:numPr>
+        <w:spacing w:before="240"/>
+        <w:rPr>
+          <w:color w:val="000000" w:themeColor="text1"/>
+        </w:rPr>
+      </w:pPr>
+      <w:r>
+        <w:rPr>
+          <w:color w:val="000000" w:themeColor="text1"/>
+        </w:rPr>
+        <w:t>go-logger : for log control (I2C console spamming)</w:t>
+      </w:r>
+    </w:p>
+    <w:p>
+      <w:pPr>
+        <w:numPr>
+          <w:ilvl w:val="1"/>
+          <w:numId w:val="5"/>
+        </w:numPr>
+        <w:spacing w:before="240"/>
+        <w:rPr>
+          <w:color w:val="000000" w:themeColor="text1"/>
+        </w:rPr>
+      </w:pPr>
+      <w:r>
+        <w:rPr>
+          <w:color w:val="000000" w:themeColor="text1"/>
+        </w:rPr>
+        <w:lastRenderedPageBreak/>
+        <w:t>Communication and safety:</w:t>
+      </w:r>
+    </w:p>
+    <w:p>
+      <w:pPr>
+        <w:numPr>
+          <w:ilvl w:val="2"/>
+          <w:numId w:val="5"/>
+        </w:numPr>
+        <w:spacing w:before="240"/>
+        <w:rPr>
+          <w:color w:val="000000" w:themeColor="text1"/>
+        </w:rPr>
+      </w:pPr>
+      <w:r>
+        <w:rPr>
+          <w:color w:val="000000" w:themeColor="text1"/>
+        </w:rPr>
+        <w:t xml:space="preserve">Bluetooth Low Energy (BLE) – GATT server using system </w:t>
+      </w:r>
+      <w:proofErr w:type="spellStart"/>
+      <w:r>
+        <w:rPr>
+          <w:color w:val="000000" w:themeColor="text1"/>
+        </w:rPr>
+        <w:t>BlueZ</w:t>
+      </w:r>
+      <w:proofErr w:type="spellEnd"/>
+    </w:p>
+    <w:p>
+      <w:pPr>
+        <w:numPr>
+          <w:ilvl w:val="2"/>
+          <w:numId w:val="5"/>
+        </w:numPr>
+        <w:spacing w:before="240"/>
+        <w:rPr>
+          <w:color w:val="000000" w:themeColor="text1"/>
+        </w:rPr>
+      </w:pPr>
+      <w:r>
+        <w:rPr>
+          <w:color w:val="000000" w:themeColor="text1"/>
+        </w:rPr>
+        <w:t>E2E encryption: AES-256 in GCM mode</w:t>
+      </w:r>
+    </w:p>
+    <w:p>
+      <w:pPr>
+        <w:numPr>
+          <w:ilvl w:val="3"/>
+          <w:numId w:val="5"/>
+        </w:numPr>
+        <w:spacing w:before="240"/>
+        <w:rPr>
+          <w:color w:val="000000" w:themeColor="text1"/>
+        </w:rPr>
+      </w:pPr>
+      <w:r>
+        <w:rPr>
+          <w:color w:val="000000" w:themeColor="text1"/>
+        </w:rPr>
+        <w:t xml:space="preserve">PSK Pre-Shared-Key key management </w:t>
+      </w:r>
+      <w:proofErr w:type="spellStart"/>
+      <w:r>
+        <w:rPr>
+          <w:color w:val="000000" w:themeColor="text1"/>
+        </w:rPr>
+        <w:t>thourgh</w:t>
+      </w:r>
+      <w:proofErr w:type="spellEnd"/>
+      <w:r>
+        <w:rPr>
+          <w:color w:val="000000" w:themeColor="text1"/>
+        </w:rPr>
+        <w:t xml:space="preserve"> environment variables</w:t>
+      </w:r>
+    </w:p>
+    <w:p>
+      <w:pPr>
+        <w:numPr>
+          <w:ilvl w:val="1"/>
+          <w:numId w:val="5"/>
+        </w:numPr>
+        <w:spacing w:before="240"/>
+        <w:rPr>
+          <w:color w:val="000000" w:themeColor="text1"/>
+        </w:rPr>
+      </w:pPr>
+      <w:r>
+        <w:rPr>
+          <w:color w:val="000000" w:themeColor="text1"/>
+        </w:rPr>
+        <w:t>Data structure: JSON</w:t>
+      </w:r>
+    </w:p>
+    <w:p>
+      <w:pPr>
+        <w:pStyle w:val="Nadpis3"/>
         <w:keepNext w:val="0"/>
         <w:keepLines w:val="0"/>
         <w:spacing w:before="280"/>
@@ -10609,7 +10800,7 @@
     </w:p>
     <w:p>
       <w:pPr>
-        <w:pStyle w:val="Heading1"/>
+        <w:pStyle w:val="Nadpis1"/>
         <w:keepNext w:val="0"/>
         <w:keepLines w:val="0"/>
         <w:spacing w:before="480"/>
@@ -13505,17 +13696,17 @@
     <w:lsdException w:name="Unresolved Mention" w:semiHidden="1" w:unhideWhenUsed="1"/>
     <w:lsdException w:name="Smart Link" w:semiHidden="1" w:unhideWhenUsed="1"/>
   </w:latentStyles>
-  <w:style w:type="paragraph" w:default="1" w:styleId="Normal">
+  <w:style w:type="paragraph" w:default="1" w:styleId="Normln">
     <w:name w:val="Normal"/>
     <w:qFormat/>
     <w:rPr>
       <w:lang w:val="en-GB"/>
     </w:rPr>
   </w:style>
-  <w:style w:type="paragraph" w:styleId="Heading1">
+  <w:style w:type="paragraph" w:styleId="Nadpis1">
     <w:name w:val="heading 1"/>
-    <w:basedOn w:val="Normal"/>
-    <w:next w:val="Normal"/>
+    <w:basedOn w:val="Normln"/>
+    <w:next w:val="Normln"/>
     <w:uiPriority w:val="9"/>
     <w:qFormat/>
     <w:pPr>
@@ -13529,10 +13720,10 @@
       <w:szCs w:val="40"/>
     </w:rPr>
   </w:style>
-  <w:style w:type="paragraph" w:styleId="Heading2">
+  <w:style w:type="paragraph" w:styleId="Nadpis2">
     <w:name w:val="heading 2"/>
-    <w:basedOn w:val="Normal"/>
-    <w:next w:val="Normal"/>
+    <w:basedOn w:val="Normln"/>
+    <w:next w:val="Normln"/>
     <w:uiPriority w:val="9"/>
     <w:unhideWhenUsed/>
     <w:qFormat/>
@@ -13547,10 +13738,10 @@
       <w:szCs w:val="32"/>
     </w:rPr>
   </w:style>
-  <w:style w:type="paragraph" w:styleId="Heading3">
+  <w:style w:type="paragraph" w:styleId="Nadpis3">
     <w:name w:val="heading 3"/>
-    <w:basedOn w:val="Normal"/>
-    <w:next w:val="Normal"/>
+    <w:basedOn w:val="Normln"/>
+    <w:next w:val="Normln"/>
     <w:uiPriority w:val="9"/>
     <w:unhideWhenUsed/>
     <w:qFormat/>
@@ -13566,10 +13757,10 @@
       <w:szCs w:val="28"/>
     </w:rPr>
   </w:style>
-  <w:style w:type="paragraph" w:styleId="Heading4">
+  <w:style w:type="paragraph" w:styleId="Nadpis4">
     <w:name w:val="heading 4"/>
-    <w:basedOn w:val="Normal"/>
-    <w:next w:val="Normal"/>
+    <w:basedOn w:val="Normln"/>
+    <w:next w:val="Normln"/>
     <w:uiPriority w:val="9"/>
     <w:unhideWhenUsed/>
     <w:qFormat/>
@@ -13585,10 +13776,10 @@
       <w:szCs w:val="24"/>
     </w:rPr>
   </w:style>
-  <w:style w:type="paragraph" w:styleId="Heading5">
+  <w:style w:type="paragraph" w:styleId="Nadpis5">
     <w:name w:val="heading 5"/>
-    <w:basedOn w:val="Normal"/>
-    <w:next w:val="Normal"/>
+    <w:basedOn w:val="Normln"/>
+    <w:next w:val="Normln"/>
     <w:uiPriority w:val="9"/>
     <w:semiHidden/>
     <w:unhideWhenUsed/>
@@ -13603,10 +13794,10 @@
       <w:color w:val="666666"/>
     </w:rPr>
   </w:style>
-  <w:style w:type="paragraph" w:styleId="Heading6">
+  <w:style w:type="paragraph" w:styleId="Nadpis6">
     <w:name w:val="heading 6"/>
-    <w:basedOn w:val="Normal"/>
-    <w:next w:val="Normal"/>
+    <w:basedOn w:val="Normln"/>
+    <w:next w:val="Normln"/>
     <w:uiPriority w:val="9"/>
     <w:semiHidden/>
     <w:unhideWhenUsed/>
@@ -13623,12 +13814,13 @@
       <w:color w:val="666666"/>
     </w:rPr>
   </w:style>
-  <w:style w:type="character" w:default="1" w:styleId="DefaultParagraphFont">
+  <w:style w:type="character" w:default="1" w:styleId="Standardnpsmoodstavce">
     <w:name w:val="Default Paragraph Font"/>
     <w:uiPriority w:val="1"/>
+    <w:semiHidden/>
     <w:unhideWhenUsed/>
   </w:style>
-  <w:style w:type="table" w:default="1" w:styleId="TableNormal">
+  <w:style w:type="table" w:default="1" w:styleId="Normlntabulka">
     <w:name w:val="Normal Table"/>
     <w:uiPriority w:val="99"/>
     <w:semiHidden/>
@@ -13643,13 +13835,13 @@
       </w:tblCellMar>
     </w:tblPr>
   </w:style>
-  <w:style w:type="numbering" w:default="1" w:styleId="NoList">
+  <w:style w:type="numbering" w:default="1" w:styleId="Bezseznamu">
     <w:name w:val="No List"/>
     <w:uiPriority w:val="99"/>
     <w:semiHidden/>
     <w:unhideWhenUsed/>
   </w:style>
-  <w:style w:type="table" w:customStyle="1" w:styleId="TableNormal0">
+  <w:style w:type="table" w:customStyle="1" w:styleId="TableNormal">
     <w:name w:val="TableNormal"/>
     <w:tblPr>
       <w:tblCellMar>
@@ -13660,10 +13852,10 @@
       </w:tblCellMar>
     </w:tblPr>
   </w:style>
-  <w:style w:type="paragraph" w:styleId="Title">
+  <w:style w:type="paragraph" w:styleId="Nzev">
     <w:name w:val="Title"/>
-    <w:basedOn w:val="Normal"/>
-    <w:next w:val="Normal"/>
+    <w:basedOn w:val="Normln"/>
+    <w:next w:val="Normln"/>
     <w:uiPriority w:val="10"/>
     <w:qFormat/>
     <w:pPr>
@@ -13676,10 +13868,10 @@
       <w:szCs w:val="52"/>
     </w:rPr>
   </w:style>
-  <w:style w:type="paragraph" w:styleId="Subtitle">
+  <w:style w:type="paragraph" w:styleId="Podnadpis">
     <w:name w:val="Subtitle"/>
-    <w:basedOn w:val="Normal"/>
-    <w:next w:val="Normal"/>
+    <w:basedOn w:val="Normln"/>
+    <w:next w:val="Normln"/>
     <w:uiPriority w:val="11"/>
     <w:qFormat/>
     <w:pPr>
@@ -13694,22 +13886,22 @@
     </w:rPr>
   </w:style>
   <w:style w:type="table" w:customStyle="1" w:styleId="a">
-    <w:basedOn w:val="TableNormal0"/>
+    <w:basedOn w:val="TableNormal"/>
     <w:tblPr>
       <w:tblStyleRowBandSize w:val="1"/>
       <w:tblStyleColBandSize w:val="1"/>
     </w:tblPr>
   </w:style>
   <w:style w:type="table" w:customStyle="1" w:styleId="a0">
-    <w:basedOn w:val="TableNormal0"/>
+    <w:basedOn w:val="TableNormal"/>
     <w:tblPr>
       <w:tblStyleRowBandSize w:val="1"/>
       <w:tblStyleColBandSize w:val="1"/>
     </w:tblPr>
   </w:style>
-  <w:style w:type="paragraph" w:styleId="ListParagraph">
+  <w:style w:type="paragraph" w:styleId="Odstavecseseznamem">
     <w:name w:val="List Paragraph"/>
-    <w:basedOn w:val="Normal"/>
+    <w:basedOn w:val="Normln"/>
     <w:uiPriority w:val="34"/>
     <w:qFormat/>
     <w:rsid w:val="0094619F"/>

</xml_diff>